<commit_message>
Finalize LR3 report with successful MySQL 8.4 GitHub run
</commit_message>
<xml_diff>
--- a/lr3/Zvit_BD_LR3_Mazeina_Opimakh_KI251.docx
+++ b/lr3/Zvit_BD_LR3_Mazeina_Opimakh_KI251.docx
@@ -4,6 +4,8 @@
   <w:body>
     <w:p>
       <w:pPr>
+        <w:pStyle w:val="Title"/>
+        <w:spacing w:before="0" w:after="100"/>
         <w:ind w:firstLine="0"/>
         <w:jc w:val="center"/>
       </w:pPr>
@@ -16,6 +18,8 @@
     </w:p>
     <w:p>
       <w:pPr>
+        <w:pStyle w:val="Title"/>
+        <w:spacing w:before="0" w:after="100"/>
         <w:ind w:firstLine="0"/>
         <w:jc w:val="center"/>
       </w:pPr>
@@ -742,7 +746,7 @@
     </w:p>
     <w:p>
       <w:r>
-        <w:t>Оригінальні SQL-файли виконано в MySQL 8.0.46. Через information_schema перевірено всі 12 зовнішніх ключів: типи залежних і батьківських полів однакові (INT); для кожного FK є індекс із цим полем на першій позиції. Додавати нові індекси не знадобилося.</w:t>
+        <w:t>SQL-файли виконано локально в MySQL 8.0.46 та повторно в MySQL 8.4.13 через GitHub Actions. Через information_schema перевірено всі 12 зовнішніх ключів: типи залежних і батьківських полів однакові (INT); для кожного FK є індекс із цим полем на першій позиції.</w:t>
       </w:r>
     </w:p>
     <w:p>
@@ -1153,7 +1157,7 @@
     </w:p>
     <w:p>
       <w:r>
-        <w:t>Кожний запит виконано в MySQL. Скриншоти показують вікно перегляду фактичного TSV-експорту результату; це не інтерфейс phpMyAdmin. Текстові експорти збережено у results/Q01.tsv–Q16.tsv, а повний вивід — у query-results.txt. Нижче подано текст SQL, призначення та результат кожного запиту.</w:t>
+        <w:t>Кожний запит виконано в MySQL 8.0.46 і повторно перевірено в MySQL 8.4.13 на GitHub. Скриншоти нижче показують вікно перегляду фактичних локальних TSV-експортів. Файли Q01.tsv–Q16.tsv збережено в results/. Повний вивід повторного запуску міститься в архіві restaurant-lr3-results.zip.</w:t>
       </w:r>
     </w:p>
     <w:p>
@@ -3010,12 +3014,20 @@
     </w:p>
     <w:p>
       <w:r>
-        <w:t>Скрипти запускаються в порядку 01_schema.sql, 02_data.sql, 03_queries.sql, 04_integrity.sql. Окремий файл restaurant_lr3.sql об’єднує ці етапи для імпорту в порожнє середовище. Схема створює окрему навчальну базу restaurant_db_lr3.</w:t>
+        <w:t>SQL-файли виконуються в порядку 01_schema.sql, 02_data.sql, 03_queries.sql, 04_integrity.sql. Для імпорту в порожнє середовище передбачено об’єднаний файл restaurant_lr3.sql. Використано базу restaurant_db_lr3.</w:t>
       </w:r>
     </w:p>
     <w:p>
       <w:r>
-        <w:t>Репозиторій проєкту попереднього етапу: https://github.com/cikatiloa902-debug/restaurant-db. Файли поточної лабораторної підготовлено в цьому пакеті; публікація змін до репозиторію є окремою дією.</w:t>
+        <w:t>Матеріали ЛР3 опубліковано в папці lr3 репозиторію: https://github.com/cikatiloa902-debug/restaurant-db. Запуск Restaurant LR3 MySQL check успішно створив 10 таблиць, завантажив 181 запис, виконав 16 запитів та експортував дамп MySQL 8.4.13. Результати і дамп збережено в артефакті restaurant-lr3-results.</w:t>
+      </w:r>
+    </w:p>
+    <w:p>
+      <w:r>
+        <w:rPr>
+          <w:sz w:val="24"/>
+        </w:rPr>
+        <w:t>Успішний запуск: https://github.com/cikatiloa902-debug/restaurant-db/actions/runs/40943065622.</w:t>
       </w:r>
     </w:p>
     <w:p>
@@ -3051,7 +3063,7 @@
     </w:p>
     <w:p>
       <w:r>
-        <w:t>3. Restaurant DB. Репозиторій проєкту. URL: https://github.com/cikatiloa902-debug/restaurant-db.</w:t>
+        <w:t>3. Restaurant DB. Матеріали ЛР3 та результати GitHub Actions. URL: https://github.com/cikatiloa902-debug/restaurant-db/tree/main/lr3.</w:t>
       </w:r>
     </w:p>
     <w:p>

</xml_diff>

<commit_message>
Replace LR3 viewer screenshots with actual MySQL terminal captures
</commit_message>
<xml_diff>
--- a/lr3/Zvit_BD_LR3_Mazeina_Opimakh_KI251.docx
+++ b/lr3/Zvit_BD_LR3_Mazeina_Opimakh_KI251.docx
@@ -1157,7 +1157,7 @@
     </w:p>
     <w:p>
       <w:r>
-        <w:t>Кожний запит виконано в MySQL 8.0.46 і повторно перевірено в MySQL 8.4.13 на GitHub. Скриншоти нижче показують вікно перегляду фактичних локальних TSV-експортів. Файли Q01.tsv–Q16.tsv збережено в results/. Повний вивід повторного запуску міститься в архіві restaurant-lr3-results.zip.</w:t>
+        <w:t>Кожний запит виконано в MySQL 8.0.46 і повторно перевірено в MySQL 8.4.13 на GitHub. Нижче наведено скриншоти виконання SQL у консольному клієнті MySQL: видно текст запиту, таблицю результату та кількість рядків. Повний вивід запуску GitHub міститься в архіві restaurant-lr3-results.zip.</w:t>
       </w:r>
     </w:p>
     <w:p>
@@ -1215,7 +1215,7 @@
       <w:r>
         <w:drawing>
           <wp:inline xmlns:a="http://schemas.openxmlformats.org/drawingml/2006/main" xmlns:pic="http://schemas.openxmlformats.org/drawingml/2006/picture">
-            <wp:extent cx="6120000" cy="3598560"/>
+            <wp:extent cx="6120000" cy="3202990"/>
             <wp:docPr id="1" name="Picture 1"/>
             <wp:cNvGraphicFramePr>
               <a:graphicFrameLocks noChangeAspect="1"/>
@@ -1236,7 +1236,7 @@
                   <pic:spPr>
                     <a:xfrm>
                       <a:off x="0" y="0"/>
-                      <a:ext cx="6120000" cy="3598560"/>
+                      <a:ext cx="6120000" cy="3202990"/>
                     </a:xfrm>
                     <a:prstGeom prst="rect"/>
                   </pic:spPr>
@@ -1315,7 +1315,7 @@
       <w:r>
         <w:drawing>
           <wp:inline xmlns:a="http://schemas.openxmlformats.org/drawingml/2006/main" xmlns:pic="http://schemas.openxmlformats.org/drawingml/2006/picture">
-            <wp:extent cx="6120000" cy="3598560"/>
+            <wp:extent cx="6120000" cy="3202990"/>
             <wp:docPr id="2" name="Picture 2"/>
             <wp:cNvGraphicFramePr>
               <a:graphicFrameLocks noChangeAspect="1"/>
@@ -1336,7 +1336,7 @@
                   <pic:spPr>
                     <a:xfrm>
                       <a:off x="0" y="0"/>
-                      <a:ext cx="6120000" cy="3598560"/>
+                      <a:ext cx="6120000" cy="3202990"/>
                     </a:xfrm>
                     <a:prstGeom prst="rect"/>
                   </pic:spPr>
@@ -1423,7 +1423,7 @@
       <w:r>
         <w:drawing>
           <wp:inline xmlns:a="http://schemas.openxmlformats.org/drawingml/2006/main" xmlns:pic="http://schemas.openxmlformats.org/drawingml/2006/picture">
-            <wp:extent cx="6120000" cy="2643840"/>
+            <wp:extent cx="6120000" cy="2859813"/>
             <wp:docPr id="3" name="Picture 3"/>
             <wp:cNvGraphicFramePr>
               <a:graphicFrameLocks noChangeAspect="1"/>
@@ -1444,7 +1444,7 @@
                   <pic:spPr>
                     <a:xfrm>
                       <a:off x="0" y="0"/>
-                      <a:ext cx="6120000" cy="2643840"/>
+                      <a:ext cx="6120000" cy="2859813"/>
                     </a:xfrm>
                     <a:prstGeom prst="rect"/>
                   </pic:spPr>
@@ -1531,7 +1531,7 @@
       <w:r>
         <w:drawing>
           <wp:inline xmlns:a="http://schemas.openxmlformats.org/drawingml/2006/main" xmlns:pic="http://schemas.openxmlformats.org/drawingml/2006/picture">
-            <wp:extent cx="6120000" cy="3121200"/>
+            <wp:extent cx="6120000" cy="3088598"/>
             <wp:docPr id="4" name="Picture 4"/>
             <wp:cNvGraphicFramePr>
               <a:graphicFrameLocks noChangeAspect="1"/>
@@ -1552,7 +1552,7 @@
                   <pic:spPr>
                     <a:xfrm>
                       <a:off x="0" y="0"/>
-                      <a:ext cx="6120000" cy="3121200"/>
+                      <a:ext cx="6120000" cy="3088598"/>
                     </a:xfrm>
                     <a:prstGeom prst="rect"/>
                   </pic:spPr>
@@ -1639,7 +1639,7 @@
       <w:r>
         <w:drawing>
           <wp:inline xmlns:a="http://schemas.openxmlformats.org/drawingml/2006/main" xmlns:pic="http://schemas.openxmlformats.org/drawingml/2006/picture">
-            <wp:extent cx="6120000" cy="1927800"/>
+            <wp:extent cx="6120000" cy="2631028"/>
             <wp:docPr id="5" name="Picture 5"/>
             <wp:cNvGraphicFramePr>
               <a:graphicFrameLocks noChangeAspect="1"/>
@@ -1660,7 +1660,7 @@
                   <pic:spPr>
                     <a:xfrm>
                       <a:off x="0" y="0"/>
-                      <a:ext cx="6120000" cy="1927800"/>
+                      <a:ext cx="6120000" cy="2631028"/>
                     </a:xfrm>
                     <a:prstGeom prst="rect"/>
                   </pic:spPr>
@@ -1763,7 +1763,7 @@
       <w:r>
         <w:drawing>
           <wp:inline xmlns:a="http://schemas.openxmlformats.org/drawingml/2006/main" xmlns:pic="http://schemas.openxmlformats.org/drawingml/2006/picture">
-            <wp:extent cx="6120000" cy="3598560"/>
+            <wp:extent cx="6120000" cy="3546168"/>
             <wp:docPr id="6" name="Picture 6"/>
             <wp:cNvGraphicFramePr>
               <a:graphicFrameLocks noChangeAspect="1"/>
@@ -1784,7 +1784,7 @@
                   <pic:spPr>
                     <a:xfrm>
                       <a:off x="0" y="0"/>
-                      <a:ext cx="6120000" cy="3598560"/>
+                      <a:ext cx="6120000" cy="3546168"/>
                     </a:xfrm>
                     <a:prstGeom prst="rect"/>
                   </pic:spPr>
@@ -1895,7 +1895,7 @@
       <w:r>
         <w:drawing>
           <wp:inline xmlns:a="http://schemas.openxmlformats.org/drawingml/2006/main" xmlns:pic="http://schemas.openxmlformats.org/drawingml/2006/picture">
-            <wp:extent cx="6120000" cy="4075920"/>
+            <wp:extent cx="6120000" cy="3889345"/>
             <wp:docPr id="7" name="Picture 7"/>
             <wp:cNvGraphicFramePr>
               <a:graphicFrameLocks noChangeAspect="1"/>
@@ -1916,7 +1916,7 @@
                   <pic:spPr>
                     <a:xfrm>
                       <a:off x="0" y="0"/>
-                      <a:ext cx="6120000" cy="4075920"/>
+                      <a:ext cx="6120000" cy="3889345"/>
                     </a:xfrm>
                     <a:prstGeom prst="rect"/>
                   </pic:spPr>
@@ -2011,7 +2011,7 @@
       <w:r>
         <w:drawing>
           <wp:inline xmlns:a="http://schemas.openxmlformats.org/drawingml/2006/main" xmlns:pic="http://schemas.openxmlformats.org/drawingml/2006/picture">
-            <wp:extent cx="6120000" cy="3598560"/>
+            <wp:extent cx="6120000" cy="3431775"/>
             <wp:docPr id="8" name="Picture 8"/>
             <wp:cNvGraphicFramePr>
               <a:graphicFrameLocks noChangeAspect="1"/>
@@ -2032,7 +2032,7 @@
                   <pic:spPr>
                     <a:xfrm>
                       <a:off x="0" y="0"/>
-                      <a:ext cx="6120000" cy="3598560"/>
+                      <a:ext cx="6120000" cy="3431775"/>
                     </a:xfrm>
                     <a:prstGeom prst="rect"/>
                   </pic:spPr>
@@ -2135,7 +2135,7 @@
       <w:r>
         <w:drawing>
           <wp:inline xmlns:a="http://schemas.openxmlformats.org/drawingml/2006/main" xmlns:pic="http://schemas.openxmlformats.org/drawingml/2006/picture">
-            <wp:extent cx="6120000" cy="2882520"/>
+            <wp:extent cx="6120000" cy="3202990"/>
             <wp:docPr id="9" name="Picture 9"/>
             <wp:cNvGraphicFramePr>
               <a:graphicFrameLocks noChangeAspect="1"/>
@@ -2156,7 +2156,7 @@
                   <pic:spPr>
                     <a:xfrm>
                       <a:off x="0" y="0"/>
-                      <a:ext cx="6120000" cy="2882520"/>
+                      <a:ext cx="6120000" cy="3202990"/>
                     </a:xfrm>
                     <a:prstGeom prst="rect"/>
                   </pic:spPr>
@@ -2259,7 +2259,7 @@
       <w:r>
         <w:drawing>
           <wp:inline xmlns:a="http://schemas.openxmlformats.org/drawingml/2006/main" xmlns:pic="http://schemas.openxmlformats.org/drawingml/2006/picture">
-            <wp:extent cx="6120000" cy="3598560"/>
+            <wp:extent cx="6120000" cy="3546168"/>
             <wp:docPr id="10" name="Picture 10"/>
             <wp:cNvGraphicFramePr>
               <a:graphicFrameLocks noChangeAspect="1"/>
@@ -2280,7 +2280,7 @@
                   <pic:spPr>
                     <a:xfrm>
                       <a:off x="0" y="0"/>
-                      <a:ext cx="6120000" cy="3598560"/>
+                      <a:ext cx="6120000" cy="3546168"/>
                     </a:xfrm>
                     <a:prstGeom prst="rect"/>
                   </pic:spPr>
@@ -2383,7 +2383,7 @@
       <w:r>
         <w:drawing>
           <wp:inline xmlns:a="http://schemas.openxmlformats.org/drawingml/2006/main" xmlns:pic="http://schemas.openxmlformats.org/drawingml/2006/picture">
-            <wp:extent cx="6120000" cy="1927800"/>
+            <wp:extent cx="6120000" cy="2745420"/>
             <wp:docPr id="11" name="Picture 11"/>
             <wp:cNvGraphicFramePr>
               <a:graphicFrameLocks noChangeAspect="1"/>
@@ -2404,7 +2404,7 @@
                   <pic:spPr>
                     <a:xfrm>
                       <a:off x="0" y="0"/>
-                      <a:ext cx="6120000" cy="1927800"/>
+                      <a:ext cx="6120000" cy="2745420"/>
                     </a:xfrm>
                     <a:prstGeom prst="rect"/>
                   </pic:spPr>
@@ -2496,7 +2496,7 @@
       <w:r>
         <w:drawing>
           <wp:inline xmlns:a="http://schemas.openxmlformats.org/drawingml/2006/main" xmlns:pic="http://schemas.openxmlformats.org/drawingml/2006/picture">
-            <wp:extent cx="6120000" cy="3598560"/>
+            <wp:extent cx="6120000" cy="3317383"/>
             <wp:docPr id="12" name="Picture 12"/>
             <wp:cNvGraphicFramePr>
               <a:graphicFrameLocks noChangeAspect="1"/>
@@ -2517,7 +2517,7 @@
                   <pic:spPr>
                     <a:xfrm>
                       <a:off x="0" y="0"/>
-                      <a:ext cx="6120000" cy="3598560"/>
+                      <a:ext cx="6120000" cy="3317383"/>
                     </a:xfrm>
                     <a:prstGeom prst="rect"/>
                   </pic:spPr>
@@ -2609,7 +2609,7 @@
       <w:r>
         <w:drawing>
           <wp:inline xmlns:a="http://schemas.openxmlformats.org/drawingml/2006/main" xmlns:pic="http://schemas.openxmlformats.org/drawingml/2006/picture">
-            <wp:extent cx="6120000" cy="2643840"/>
+            <wp:extent cx="6120000" cy="2859813"/>
             <wp:docPr id="13" name="Picture 13"/>
             <wp:cNvGraphicFramePr>
               <a:graphicFrameLocks noChangeAspect="1"/>
@@ -2630,7 +2630,7 @@
                   <pic:spPr>
                     <a:xfrm>
                       <a:off x="0" y="0"/>
-                      <a:ext cx="6120000" cy="2643840"/>
+                      <a:ext cx="6120000" cy="2859813"/>
                     </a:xfrm>
                     <a:prstGeom prst="rect"/>
                   </pic:spPr>
@@ -2722,7 +2722,7 @@
       <w:r>
         <w:drawing>
           <wp:inline xmlns:a="http://schemas.openxmlformats.org/drawingml/2006/main" xmlns:pic="http://schemas.openxmlformats.org/drawingml/2006/picture">
-            <wp:extent cx="6120000" cy="2166480"/>
+            <wp:extent cx="6120000" cy="2631028"/>
             <wp:docPr id="14" name="Picture 14"/>
             <wp:cNvGraphicFramePr>
               <a:graphicFrameLocks noChangeAspect="1"/>
@@ -2743,7 +2743,7 @@
                   <pic:spPr>
                     <a:xfrm>
                       <a:off x="0" y="0"/>
-                      <a:ext cx="6120000" cy="2166480"/>
+                      <a:ext cx="6120000" cy="2631028"/>
                     </a:xfrm>
                     <a:prstGeom prst="rect"/>
                   </pic:spPr>
@@ -2830,7 +2830,7 @@
       <w:r>
         <w:drawing>
           <wp:inline xmlns:a="http://schemas.openxmlformats.org/drawingml/2006/main" xmlns:pic="http://schemas.openxmlformats.org/drawingml/2006/picture">
-            <wp:extent cx="6120000" cy="2882520"/>
+            <wp:extent cx="6120000" cy="2974205"/>
             <wp:docPr id="15" name="Picture 15"/>
             <wp:cNvGraphicFramePr>
               <a:graphicFrameLocks noChangeAspect="1"/>
@@ -2851,7 +2851,7 @@
                   <pic:spPr>
                     <a:xfrm>
                       <a:off x="0" y="0"/>
-                      <a:ext cx="6120000" cy="2882520"/>
+                      <a:ext cx="6120000" cy="2974205"/>
                     </a:xfrm>
                     <a:prstGeom prst="rect"/>
                   </pic:spPr>
@@ -2954,7 +2954,7 @@
       <w:r>
         <w:drawing>
           <wp:inline xmlns:a="http://schemas.openxmlformats.org/drawingml/2006/main" xmlns:pic="http://schemas.openxmlformats.org/drawingml/2006/picture">
-            <wp:extent cx="6120000" cy="3121200"/>
+            <wp:extent cx="6120000" cy="3317383"/>
             <wp:docPr id="16" name="Picture 16"/>
             <wp:cNvGraphicFramePr>
               <a:graphicFrameLocks noChangeAspect="1"/>
@@ -2975,7 +2975,7 @@
                   <pic:spPr>
                     <a:xfrm>
                       <a:off x="0" y="0"/>
-                      <a:ext cx="6120000" cy="3121200"/>
+                      <a:ext cx="6120000" cy="3317383"/>
                     </a:xfrm>
                     <a:prstGeom prst="rect"/>
                   </pic:spPr>

</xml_diff>